<commit_message>
Reworked reports of DBes and get it to PDF
</commit_message>
<xml_diff>
--- a/Отчёты/БД/1Лаб.docx
+++ b/Отчёты/БД/1Лаб.docx
@@ -314,10 +314,7 @@
         <w:t xml:space="preserve">Цель работы: </w:t>
       </w:r>
       <w:r>
-        <w:t>п</w:t>
-      </w:r>
-      <w:r>
-        <w:t xml:space="preserve">олучение навыков работы по созданию базы данных (БД), созданию и редактированию таблиц, знакомство со средой и объектами </w:t>
+        <w:t xml:space="preserve">получение навыков работы по созданию базы данных (БД), созданию и редактированию таблиц, знакомство со средой и объектами </w:t>
       </w:r>
       <w:r>
         <w:rPr>
@@ -373,10 +370,7 @@
       </w:r>
       <w:proofErr w:type="spellEnd"/>
       <w:r>
-        <w:t>&gt;</w:t>
-      </w:r>
-      <w:r>
-        <w:t>.</w:t>
+        <w:t>&gt;.</w:t>
       </w:r>
     </w:p>
     <w:p>
@@ -504,7 +498,13 @@
         <w:pStyle w:val="aff"/>
       </w:pPr>
       <w:r>
-        <w:t>Аналогично создаём таблицу «Товары», заполняем произвольными данными. Результат представлен на рисунке 2.</w:t>
+        <w:t xml:space="preserve">Аналогично создаём таблицу «Товары», заполняем </w:t>
+      </w:r>
+      <w:r>
+        <w:t>данными из варианта</w:t>
+      </w:r>
+      <w:r>
+        <w:t>. Результат представлен на рисунке 2.</w:t>
       </w:r>
     </w:p>
     <w:p>
@@ -519,9 +519,9 @@
           <w:noProof/>
         </w:rPr>
         <w:drawing>
-          <wp:inline distT="0" distB="0" distL="0" distR="0" wp14:anchorId="12C909D7" wp14:editId="38B78AB4">
-            <wp:extent cx="4407465" cy="2453640"/>
-            <wp:effectExtent l="0" t="0" r="0" b="3810"/>
+          <wp:inline distT="0" distB="0" distL="0" distR="0" wp14:anchorId="12C909D7" wp14:editId="478B0997">
+            <wp:extent cx="4267200" cy="2375554"/>
+            <wp:effectExtent l="0" t="0" r="0" b="5715"/>
             <wp:docPr id="2" name="Рисунок 2"/>
             <wp:cNvGraphicFramePr>
               <a:graphicFrameLocks xmlns:a="http://schemas.openxmlformats.org/drawingml/2006/main" noChangeAspect="1"/>
@@ -542,7 +542,7 @@
                   <pic:spPr>
                     <a:xfrm>
                       <a:off x="0" y="0"/>
-                      <a:ext cx="4421193" cy="2461282"/>
+                      <a:ext cx="4291481" cy="2389071"/>
                     </a:xfrm>
                     <a:prstGeom prst="rect">
                       <a:avLst/>
@@ -590,9 +590,9 @@
           <w:noProof/>
         </w:rPr>
         <w:drawing>
-          <wp:inline distT="0" distB="0" distL="0" distR="0" wp14:anchorId="5C75F0DE" wp14:editId="37487269">
-            <wp:extent cx="4229100" cy="1501454"/>
-            <wp:effectExtent l="0" t="0" r="0" b="3810"/>
+          <wp:inline distT="0" distB="0" distL="0" distR="0" wp14:anchorId="5C75F0DE" wp14:editId="786E8D76">
+            <wp:extent cx="3884807" cy="1379220"/>
+            <wp:effectExtent l="0" t="0" r="1905" b="0"/>
             <wp:docPr id="5" name="Рисунок 5"/>
             <wp:cNvGraphicFramePr>
               <a:graphicFrameLocks xmlns:a="http://schemas.openxmlformats.org/drawingml/2006/main" noChangeAspect="1"/>
@@ -613,7 +613,7 @@
                   <pic:spPr>
                     <a:xfrm>
                       <a:off x="0" y="0"/>
-                      <a:ext cx="4304896" cy="1528364"/>
+                      <a:ext cx="3973723" cy="1410788"/>
                     </a:xfrm>
                     <a:prstGeom prst="rect">
                       <a:avLst/>
@@ -632,7 +632,6 @@
         <w:spacing w:line="240" w:lineRule="auto"/>
       </w:pPr>
       <w:r>
-        <w:lastRenderedPageBreak/>
         <w:t>Рисунок 3 – Заполненная таблица «Товары»</w:t>
       </w:r>
     </w:p>
@@ -652,6 +651,7 @@
         <w:rPr>
           <w:noProof/>
         </w:rPr>
+        <w:lastRenderedPageBreak/>
         <w:drawing>
           <wp:inline distT="0" distB="0" distL="0" distR="0" wp14:anchorId="72BABBA4" wp14:editId="51D61611">
             <wp:extent cx="5940425" cy="778510"/>
@@ -875,11 +875,10 @@
         <w:rPr>
           <w:noProof/>
         </w:rPr>
-        <w:lastRenderedPageBreak/>
         <w:drawing>
-          <wp:inline distT="0" distB="0" distL="0" distR="0" wp14:anchorId="65840B79" wp14:editId="6B5B4BA6">
-            <wp:extent cx="5940425" cy="1817370"/>
-            <wp:effectExtent l="0" t="0" r="3175" b="0"/>
+          <wp:inline distT="0" distB="0" distL="0" distR="0" wp14:anchorId="65840B79" wp14:editId="541AE496">
+            <wp:extent cx="5341620" cy="1634176"/>
+            <wp:effectExtent l="0" t="0" r="0" b="4445"/>
             <wp:docPr id="9" name="Рисунок 9"/>
             <wp:cNvGraphicFramePr>
               <a:graphicFrameLocks xmlns:a="http://schemas.openxmlformats.org/drawingml/2006/main" noChangeAspect="1"/>
@@ -900,7 +899,7 @@
                   <pic:spPr>
                     <a:xfrm>
                       <a:off x="0" y="0"/>
-                      <a:ext cx="5940425" cy="1817370"/>
+                      <a:ext cx="5384576" cy="1647318"/>
                     </a:xfrm>
                     <a:prstGeom prst="rect">
                       <a:avLst/>
@@ -936,6 +935,7 @@
         <w:pStyle w:val="aff"/>
       </w:pPr>
       <w:r>
+        <w:lastRenderedPageBreak/>
         <w:t xml:space="preserve">Чтобы создать список для выбора в </w:t>
       </w:r>
       <w:r>
@@ -1124,38 +1124,361 @@
         <w:pStyle w:val="aff"/>
       </w:pPr>
       <w:r>
-        <w:t>1. Вывод всех записей и полей из таблицы с их сортировкой по фамилии студента</w:t>
-      </w:r>
-      <w:r>
-        <w:t>. Запрос представлен на листинге 1.</w:t>
+        <w:t>1. Вывод всех записей и полей из таблицы с их сортировкой по фамилии студента. Запрос представлен на листинге 1.</w:t>
       </w:r>
     </w:p>
     <w:p>
       <w:pPr>
         <w:pStyle w:val="af5"/>
+      </w:pPr>
+      <w:r>
         <w:rPr>
           <w:lang w:val="en-US"/>
         </w:rPr>
+        <w:t>SELECT</w:t>
+      </w:r>
+      <w:r>
+        <w:t xml:space="preserve"> *</w:t>
+      </w:r>
+    </w:p>
+    <w:p>
+      <w:pPr>
+        <w:pStyle w:val="af5"/>
       </w:pPr>
       <w:r>
         <w:rPr>
           <w:lang w:val="en-US"/>
         </w:rPr>
+        <w:t>FROM</w:t>
+      </w:r>
+      <w:r>
+        <w:t xml:space="preserve"> </w:t>
+      </w:r>
+      <w:proofErr w:type="spellStart"/>
+      <w:r>
+        <w:t>студентики</w:t>
+      </w:r>
+      <w:proofErr w:type="spellEnd"/>
+    </w:p>
+    <w:p>
+      <w:pPr>
+        <w:pStyle w:val="af5"/>
+        <w:spacing w:after="0"/>
+      </w:pPr>
+      <w:r>
+        <w:rPr>
+          <w:lang w:val="en-US"/>
+        </w:rPr>
+        <w:t>ORDER</w:t>
+      </w:r>
+      <w:r>
+        <w:t xml:space="preserve"> </w:t>
+      </w:r>
+      <w:r>
+        <w:rPr>
+          <w:lang w:val="en-US"/>
+        </w:rPr>
+        <w:t>BY</w:t>
+      </w:r>
+      <w:r>
+        <w:t xml:space="preserve"> </w:t>
+      </w:r>
+      <w:r>
+        <w:t>Студент</w:t>
+      </w:r>
+      <w:r>
+        <w:t>;</w:t>
+      </w:r>
+    </w:p>
+    <w:p>
+      <w:pPr>
+        <w:pStyle w:val="af8"/>
+      </w:pPr>
+      <w:r>
+        <w:t>Листинг 1 – Вывод упорядоченных по убыванию студентов</w:t>
+      </w:r>
+    </w:p>
+    <w:p>
+      <w:pPr>
+        <w:pStyle w:val="aff"/>
+      </w:pPr>
+      <w:r>
+        <w:t>2. Вывод всех записей с полями (Студент, Группа, Дата рождения) только для факультета ЭФ. Запрос представлен на листинге 2.</w:t>
+      </w:r>
+    </w:p>
+    <w:p>
+      <w:pPr>
+        <w:pStyle w:val="af5"/>
+      </w:pPr>
+      <w:r>
+        <w:t>SELECT Студент, Группа, [Дата рождения]</w:t>
+      </w:r>
+    </w:p>
+    <w:p>
+      <w:pPr>
+        <w:pStyle w:val="af5"/>
+      </w:pPr>
+      <w:r>
+        <w:t xml:space="preserve">FROM </w:t>
+      </w:r>
+      <w:proofErr w:type="spellStart"/>
+      <w:r>
+        <w:t>студентики</w:t>
+      </w:r>
+      <w:proofErr w:type="spellEnd"/>
+    </w:p>
+    <w:p>
+      <w:pPr>
+        <w:pStyle w:val="af5"/>
+        <w:spacing w:after="0"/>
+      </w:pPr>
+      <w:r>
+        <w:t>WHERE Факультет=</w:t>
+      </w:r>
+      <w:r>
+        <w:t>«</w:t>
+      </w:r>
+      <w:r>
+        <w:t>ЭФ</w:t>
+      </w:r>
+      <w:r>
+        <w:t>»</w:t>
+      </w:r>
+      <w:r>
+        <w:t>;</w:t>
+      </w:r>
+    </w:p>
+    <w:p>
+      <w:pPr>
+        <w:pStyle w:val="af8"/>
+      </w:pPr>
+      <w:r>
+        <w:t>Листинг 2 – Вывод студентов, обучающихся на ЭФ</w:t>
+      </w:r>
+    </w:p>
+    <w:p>
+      <w:pPr>
+        <w:pStyle w:val="aff"/>
+      </w:pPr>
+      <w:r>
+        <w:t>3. Вывод списка студентов Специальности «Экономика», родившихся в 2002 году.</w:t>
+      </w:r>
+      <w:r>
+        <w:t xml:space="preserve"> </w:t>
+      </w:r>
+      <w:r>
+        <w:t>Запрос представлен на листинге 3.</w:t>
+      </w:r>
+    </w:p>
+    <w:p>
+      <w:pPr>
+        <w:pStyle w:val="af5"/>
+      </w:pPr>
+      <w:r>
         <w:lastRenderedPageBreak/>
-        <w:t>SELECT *</w:t>
+        <w:t>SELECT Студент</w:t>
       </w:r>
     </w:p>
     <w:p>
       <w:pPr>
         <w:pStyle w:val="af5"/>
+      </w:pPr>
+      <w:r>
+        <w:t xml:space="preserve">FROM </w:t>
+      </w:r>
+      <w:proofErr w:type="spellStart"/>
+      <w:r>
+        <w:t>студентики</w:t>
+      </w:r>
+      <w:proofErr w:type="spellEnd"/>
+    </w:p>
+    <w:p>
+      <w:pPr>
+        <w:pStyle w:val="af5"/>
+        <w:spacing w:after="0"/>
+      </w:pPr>
+      <w:r>
+        <w:t>WHERE Специальность=</w:t>
+      </w:r>
+      <w:r>
+        <w:t>«</w:t>
+      </w:r>
+      <w:r>
+        <w:t>Экономика</w:t>
+      </w:r>
+      <w:r>
+        <w:t>»</w:t>
+      </w:r>
+      <w:r>
+        <w:t xml:space="preserve"> And Year([Дата рождения])=2002;</w:t>
+      </w:r>
+    </w:p>
+    <w:p>
+      <w:pPr>
+        <w:pStyle w:val="af8"/>
+      </w:pPr>
+      <w:r>
+        <w:t>Листинг 3 – Вывод студентов 2002 года, обучающихся на экономике</w:t>
+      </w:r>
+    </w:p>
+    <w:p>
+      <w:pPr>
+        <w:pStyle w:val="aff"/>
+      </w:pPr>
+      <w:r>
+        <w:t>4</w:t>
+      </w:r>
+      <w:r>
+        <w:t>. Вывод всех полей для студентов, у которых фамилия начинается на букву «Б». Запрос представлен на листинге 4.</w:t>
+      </w:r>
+    </w:p>
+    <w:p>
+      <w:pPr>
+        <w:pStyle w:val="af5"/>
+      </w:pPr>
+      <w:r>
         <w:rPr>
           <w:lang w:val="en-US"/>
         </w:rPr>
+        <w:t>SELECT</w:t>
+      </w:r>
+      <w:r>
+        <w:t xml:space="preserve"> *</w:t>
+      </w:r>
+    </w:p>
+    <w:p>
+      <w:pPr>
+        <w:pStyle w:val="af5"/>
       </w:pPr>
       <w:r>
         <w:rPr>
           <w:lang w:val="en-US"/>
         </w:rPr>
+        <w:t>FROM</w:t>
+      </w:r>
+      <w:r>
+        <w:t xml:space="preserve"> </w:t>
+      </w:r>
+      <w:proofErr w:type="spellStart"/>
+      <w:r>
+        <w:t>студентики</w:t>
+      </w:r>
+      <w:proofErr w:type="spellEnd"/>
+    </w:p>
+    <w:p>
+      <w:pPr>
+        <w:pStyle w:val="af5"/>
+        <w:spacing w:after="0"/>
+      </w:pPr>
+      <w:r>
+        <w:rPr>
+          <w:lang w:val="en-US"/>
+        </w:rPr>
+        <w:t>WHERE</w:t>
+      </w:r>
+      <w:r>
+        <w:t xml:space="preserve"> </w:t>
+      </w:r>
+      <w:r>
+        <w:t>Студент</w:t>
+      </w:r>
+      <w:r>
+        <w:t xml:space="preserve"> </w:t>
+      </w:r>
+      <w:r>
+        <w:rPr>
+          <w:lang w:val="en-US"/>
+        </w:rPr>
+        <w:t>LIKE</w:t>
+      </w:r>
+      <w:r>
+        <w:t xml:space="preserve"> "</w:t>
+      </w:r>
+      <w:r>
+        <w:t>Б</w:t>
+      </w:r>
+      <w:r>
+        <w:t>*";</w:t>
+      </w:r>
+    </w:p>
+    <w:p>
+      <w:pPr>
+        <w:pStyle w:val="af8"/>
+      </w:pPr>
+      <w:r>
+        <w:t>Листинг 4 – Вывод студентов, чья фамилия начинается на «Б»</w:t>
+      </w:r>
+    </w:p>
+    <w:p>
+      <w:pPr>
+        <w:pStyle w:val="aff"/>
+      </w:pPr>
+      <w:r>
+        <w:t>5. Создайте запрос на изменение данных, который реализует изменение номера группы 510 на 520. Запрос представлен на листинге 5.</w:t>
+      </w:r>
+    </w:p>
+    <w:p>
+      <w:pPr>
+        <w:pStyle w:val="af5"/>
+      </w:pPr>
+      <w:r>
+        <w:t xml:space="preserve">UPDATE </w:t>
+      </w:r>
+      <w:proofErr w:type="spellStart"/>
+      <w:r>
+        <w:t>студентики</w:t>
+      </w:r>
+      <w:proofErr w:type="spellEnd"/>
+      <w:r>
+        <w:t xml:space="preserve"> SET группа = '520'</w:t>
+      </w:r>
+    </w:p>
+    <w:p>
+      <w:pPr>
+        <w:pStyle w:val="af5"/>
+        <w:spacing w:after="0"/>
+      </w:pPr>
+      <w:r>
+        <w:t>WHERE группа = '510';</w:t>
+      </w:r>
+    </w:p>
+    <w:p>
+      <w:pPr>
+        <w:pStyle w:val="af8"/>
+      </w:pPr>
+      <w:r>
+        <w:t>Листинг 5 – Изменение групп с 510 на 520</w:t>
+      </w:r>
+    </w:p>
+    <w:p>
+      <w:pPr>
+        <w:pStyle w:val="aff"/>
+      </w:pPr>
+      <w:r>
+        <w:t>6. Посчитайте количество студентов на факультете ФВС. Запрос представлен на листинге 6.</w:t>
+      </w:r>
+    </w:p>
+    <w:p>
+      <w:pPr>
+        <w:pStyle w:val="af5"/>
+      </w:pPr>
+      <w:r>
+        <w:t xml:space="preserve">SELECT </w:t>
+      </w:r>
+      <w:proofErr w:type="spellStart"/>
+      <w:r>
+        <w:t>count</w:t>
+      </w:r>
+      <w:proofErr w:type="spellEnd"/>
+      <w:r>
+        <w:t>(Факультет)</w:t>
+      </w:r>
+    </w:p>
+    <w:p>
+      <w:pPr>
+        <w:pStyle w:val="af5"/>
+      </w:pPr>
+      <w:r>
         <w:t xml:space="preserve">FROM </w:t>
       </w:r>
       <w:proofErr w:type="spellStart"/>
@@ -1167,35 +1490,38 @@
     <w:p>
       <w:pPr>
         <w:pStyle w:val="af5"/>
-        <w:rPr>
-          <w:lang w:val="en-US"/>
-        </w:rPr>
-      </w:pPr>
-      <w:r>
-        <w:rPr>
-          <w:lang w:val="en-US"/>
-        </w:rPr>
-        <w:t xml:space="preserve">ORDER BY </w:t>
-      </w:r>
-      <w:r>
-        <w:t>Студент</w:t>
-      </w:r>
-      <w:r>
-        <w:rPr>
-          <w:lang w:val="en-US"/>
-        </w:rPr>
+        <w:spacing w:after="0"/>
+      </w:pPr>
+      <w:r>
+        <w:t xml:space="preserve">WHERE Факультет = </w:t>
+      </w:r>
+      <w:r>
+        <w:t>«</w:t>
+      </w:r>
+      <w:r>
+        <w:t>ФВС</w:t>
+      </w:r>
+      <w:r>
+        <w:t>»</w:t>
+      </w:r>
+      <w:r>
         <w:t>;</w:t>
       </w:r>
     </w:p>
     <w:p>
       <w:pPr>
+        <w:pStyle w:val="af8"/>
+      </w:pPr>
+      <w:r>
+        <w:t>Листинг 6 – Вывод студентов, обучающихся на успешном факультете</w:t>
+      </w:r>
+    </w:p>
+    <w:p>
+      <w:pPr>
         <w:pStyle w:val="aff"/>
       </w:pPr>
       <w:r>
-        <w:t>2. Вывод всех записей с полями (Студент, Группа, Дата рождения) только для факультета ЭФ</w:t>
-      </w:r>
-      <w:r>
-        <w:t>. Запрос представлен на листинге 2.</w:t>
+        <w:t>7. Посчитайте количество студентов, родившихся в 2002 году. Запрос представлен на листинге 7.</w:t>
       </w:r>
     </w:p>
     <w:p>
@@ -1203,7 +1529,15 @@
         <w:pStyle w:val="af5"/>
       </w:pPr>
       <w:r>
-        <w:t>SELECT Студент, Группа, [Дата рождения]</w:t>
+        <w:t xml:space="preserve">SELECT </w:t>
+      </w:r>
+      <w:proofErr w:type="spellStart"/>
+      <w:r>
+        <w:t>count</w:t>
+      </w:r>
+      <w:proofErr w:type="spellEnd"/>
+      <w:r>
+        <w:t>(Студент)</w:t>
       </w:r>
     </w:p>
     <w:p>
@@ -1222,9 +1556,18 @@
     <w:p>
       <w:pPr>
         <w:pStyle w:val="af5"/>
-      </w:pPr>
-      <w:r>
-        <w:t>WHERE Факультет="ЭФ";</w:t>
+        <w:spacing w:after="0"/>
+      </w:pPr>
+      <w:r>
+        <w:t>WHERE Year([Дата рождения]) = 2002;</w:t>
+      </w:r>
+    </w:p>
+    <w:p>
+      <w:pPr>
+        <w:pStyle w:val="af8"/>
+      </w:pPr>
+      <w:r>
+        <w:t>Листинг 7 – Вывод студентов, родившихся в 2002 году</w:t>
       </w:r>
     </w:p>
     <w:p>
@@ -1232,298 +1575,7 @@
         <w:pStyle w:val="aff"/>
       </w:pPr>
       <w:r>
-        <w:t>3. Вывод списка студентов Специальности «Экономика», родившихся в 2002 году</w:t>
-      </w:r>
-      <w:r>
-        <w:t>. Запрос представлен на листинге 3.</w:t>
-      </w:r>
-    </w:p>
-    <w:p>
-      <w:pPr>
-        <w:pStyle w:val="af5"/>
-      </w:pPr>
-      <w:r>
-        <w:t>SELECT Студент</w:t>
-      </w:r>
-    </w:p>
-    <w:p>
-      <w:pPr>
-        <w:pStyle w:val="af5"/>
-      </w:pPr>
-      <w:r>
-        <w:t xml:space="preserve">FROM </w:t>
-      </w:r>
-      <w:proofErr w:type="spellStart"/>
-      <w:r>
-        <w:t>студентики</w:t>
-      </w:r>
-      <w:proofErr w:type="spellEnd"/>
-    </w:p>
-    <w:p>
-      <w:pPr>
-        <w:pStyle w:val="af5"/>
-      </w:pPr>
-      <w:r>
-        <w:t xml:space="preserve">WHERE Специальность="Экономика" And </w:t>
-      </w:r>
-      <w:proofErr w:type="gramStart"/>
-      <w:r>
-        <w:t>Year(</w:t>
-      </w:r>
-      <w:proofErr w:type="gramEnd"/>
-      <w:r>
-        <w:t>[Дата рождения])=2002;</w:t>
-      </w:r>
-    </w:p>
-    <w:p>
-      <w:pPr>
-        <w:pStyle w:val="aff"/>
-      </w:pPr>
-      <w:r>
-        <w:t>4</w:t>
-      </w:r>
-      <w:r>
-        <w:t>. Вывод всех полей для студентов, у которых фамилия начинается на букву «Б»</w:t>
-      </w:r>
-      <w:r>
-        <w:t>. Запрос представлен на листинге 4.</w:t>
-      </w:r>
-    </w:p>
-    <w:p>
-      <w:pPr>
-        <w:pStyle w:val="af5"/>
-        <w:rPr>
-          <w:lang w:val="en-US"/>
-        </w:rPr>
-      </w:pPr>
-      <w:r>
-        <w:rPr>
-          <w:lang w:val="en-US"/>
-        </w:rPr>
-        <w:t>SELECT *</w:t>
-      </w:r>
-    </w:p>
-    <w:p>
-      <w:pPr>
-        <w:pStyle w:val="af5"/>
-        <w:rPr>
-          <w:lang w:val="en-US"/>
-        </w:rPr>
-      </w:pPr>
-      <w:r>
-        <w:rPr>
-          <w:lang w:val="en-US"/>
-        </w:rPr>
-        <w:t xml:space="preserve">FROM </w:t>
-      </w:r>
-      <w:proofErr w:type="spellStart"/>
-      <w:r>
-        <w:t>студентики</w:t>
-      </w:r>
-      <w:proofErr w:type="spellEnd"/>
-    </w:p>
-    <w:p>
-      <w:pPr>
-        <w:pStyle w:val="af5"/>
-        <w:rPr>
-          <w:lang w:val="en-US"/>
-        </w:rPr>
-      </w:pPr>
-      <w:r>
-        <w:rPr>
-          <w:lang w:val="en-US"/>
-        </w:rPr>
-        <w:t xml:space="preserve">WHERE </w:t>
-      </w:r>
-      <w:r>
-        <w:t>Студент</w:t>
-      </w:r>
-      <w:r>
-        <w:rPr>
-          <w:lang w:val="en-US"/>
-        </w:rPr>
-        <w:t xml:space="preserve"> LIKE "</w:t>
-      </w:r>
-      <w:r>
-        <w:t>Б</w:t>
-      </w:r>
-      <w:r>
-        <w:rPr>
-          <w:lang w:val="en-US"/>
-        </w:rPr>
-        <w:t>*";</w:t>
-      </w:r>
-    </w:p>
-    <w:p>
-      <w:pPr>
-        <w:pStyle w:val="aff"/>
-      </w:pPr>
-      <w:r>
-        <w:t>5. Создайте запрос на изменение данных, который реализует изменение номера группы 510 на 520</w:t>
-      </w:r>
-      <w:r>
-        <w:t>. Запрос представлен на листинге 5.</w:t>
-      </w:r>
-    </w:p>
-    <w:p>
-      <w:pPr>
-        <w:pStyle w:val="af5"/>
-      </w:pPr>
-      <w:r>
-        <w:t xml:space="preserve">UPDATE </w:t>
-      </w:r>
-      <w:proofErr w:type="spellStart"/>
-      <w:r>
-        <w:t>студентики</w:t>
-      </w:r>
-      <w:proofErr w:type="spellEnd"/>
-      <w:r>
-        <w:t xml:space="preserve"> SET группа = '520'</w:t>
-      </w:r>
-    </w:p>
-    <w:p>
-      <w:pPr>
-        <w:pStyle w:val="af5"/>
-      </w:pPr>
-      <w:r>
-        <w:t>WHERE группа = '510';</w:t>
-      </w:r>
-    </w:p>
-    <w:p>
-      <w:pPr>
-        <w:pStyle w:val="aff"/>
-      </w:pPr>
-      <w:r>
-        <w:t>6. Посчитайте количество студентов на факультете ФВС</w:t>
-      </w:r>
-      <w:r>
-        <w:t>. Запрос представлен на листинге 6.</w:t>
-      </w:r>
-    </w:p>
-    <w:p>
-      <w:pPr>
-        <w:pStyle w:val="af5"/>
-      </w:pPr>
-      <w:r>
-        <w:t xml:space="preserve">SELECT </w:t>
-      </w:r>
-      <w:proofErr w:type="spellStart"/>
-      <w:proofErr w:type="gramStart"/>
-      <w:r>
-        <w:t>count</w:t>
-      </w:r>
-      <w:proofErr w:type="spellEnd"/>
-      <w:r>
-        <w:t>(</w:t>
-      </w:r>
-      <w:proofErr w:type="gramEnd"/>
-      <w:r>
-        <w:t>Факультет)</w:t>
-      </w:r>
-    </w:p>
-    <w:p>
-      <w:pPr>
-        <w:pStyle w:val="af5"/>
-      </w:pPr>
-      <w:r>
-        <w:t xml:space="preserve">FROM </w:t>
-      </w:r>
-      <w:proofErr w:type="spellStart"/>
-      <w:r>
-        <w:t>студентики</w:t>
-      </w:r>
-      <w:proofErr w:type="spellEnd"/>
-    </w:p>
-    <w:p>
-      <w:pPr>
-        <w:pStyle w:val="af5"/>
-      </w:pPr>
-      <w:r>
-        <w:t>WHERE Факультет = "ФВС";</w:t>
-      </w:r>
-    </w:p>
-    <w:p>
-      <w:pPr>
-        <w:pStyle w:val="aff"/>
-      </w:pPr>
-      <w:r>
-        <w:t>7. Посчитайте количество студентов, родившихся в 2002 году</w:t>
-      </w:r>
-      <w:r>
-        <w:t>. Запрос представлен на листинге 7.</w:t>
-      </w:r>
-    </w:p>
-    <w:p>
-      <w:pPr>
-        <w:pStyle w:val="af5"/>
-      </w:pPr>
-      <w:r>
-        <w:t xml:space="preserve">SELECT </w:t>
-      </w:r>
-      <w:proofErr w:type="spellStart"/>
-      <w:proofErr w:type="gramStart"/>
-      <w:r>
-        <w:t>count</w:t>
-      </w:r>
-      <w:proofErr w:type="spellEnd"/>
-      <w:r>
-        <w:t>(</w:t>
-      </w:r>
-      <w:proofErr w:type="gramEnd"/>
-      <w:r>
-        <w:t>Студент)</w:t>
-      </w:r>
-    </w:p>
-    <w:p>
-      <w:pPr>
-        <w:pStyle w:val="af5"/>
-      </w:pPr>
-      <w:r>
-        <w:t xml:space="preserve">FROM </w:t>
-      </w:r>
-      <w:proofErr w:type="spellStart"/>
-      <w:r>
-        <w:t>студентики</w:t>
-      </w:r>
-      <w:proofErr w:type="spellEnd"/>
-    </w:p>
-    <w:p>
-      <w:pPr>
-        <w:pStyle w:val="af5"/>
-      </w:pPr>
-      <w:r>
-        <w:t xml:space="preserve">WHERE </w:t>
-      </w:r>
-      <w:proofErr w:type="gramStart"/>
-      <w:r>
-        <w:t>Year(</w:t>
-      </w:r>
-      <w:proofErr w:type="gramEnd"/>
-      <w:r>
-        <w:t>[Дата рождения]) = 2002;</w:t>
-      </w:r>
-    </w:p>
-    <w:p>
-      <w:pPr>
-        <w:pStyle w:val="aff"/>
-      </w:pPr>
-      <w:r>
-        <w:t xml:space="preserve">Вывод: </w:t>
-      </w:r>
-      <w:r>
-        <w:t>получен</w:t>
-      </w:r>
-      <w:r>
-        <w:t>ы</w:t>
-      </w:r>
-      <w:r>
-        <w:t xml:space="preserve"> навык</w:t>
-      </w:r>
-      <w:r>
-        <w:t>и</w:t>
-      </w:r>
-      <w:r>
-        <w:t xml:space="preserve"> работы по созданию базы данных (БД), создани</w:t>
+        <w:t>Вывод: получены навыки работы по созданию базы данных (БД), создани</w:t>
       </w:r>
       <w:r>
         <w:t>я</w:t>
@@ -3677,6 +3729,7 @@
   <w:style w:type="character" w:default="1" w:styleId="a2">
     <w:name w:val="Default Paragraph Font"/>
     <w:uiPriority w:val="1"/>
+    <w:semiHidden/>
     <w:unhideWhenUsed/>
   </w:style>
   <w:style w:type="table" w:default="1" w:styleId="a3">

</xml_diff>